<commit_message>
Actualizacion plan de proyecto
</commit_message>
<xml_diff>
--- a/Plan_De_Proyecto_Plataforma_De_Streaming_JUAN MARTINEZ _CRISTIAN RUEDA.docx
+++ b/Plan_De_Proyecto_Plataforma_De_Streaming_JUAN MARTINEZ _CRISTIAN RUEDA.docx
@@ -1328,13 +1328,13 @@
         </w:rPr>
         <w:t>PlayReady</w:t>
       </w:r>
+      <w:proofErr w:type="spellEnd"/>
       <w:r>
         <w:rPr>
           <w:lang w:val="es-CO"/>
         </w:rPr>
         <w:t>.</w:t>
       </w:r>
-      <w:proofErr w:type="spellEnd"/>
     </w:p>
     <w:p>
       <w:pPr>
@@ -5624,41 +5624,25 @@
           <w:b/>
           <w:bCs/>
         </w:rPr>
-        <w:t xml:space="preserve"> </w:t>
-      </w:r>
+        <w:t xml:space="preserve"> Se </w:t>
+      </w:r>
+      <w:proofErr w:type="spellStart"/>
       <w:r>
         <w:rPr>
           <w:rFonts w:cs="Arial"/>
           <w:b/>
           <w:bCs/>
         </w:rPr>
-        <w:t xml:space="preserve">Se </w:t>
-      </w:r>
-      <w:proofErr w:type="spellStart"/>
+        <w:t>Usa</w:t>
+      </w:r>
+      <w:proofErr w:type="spellEnd"/>
       <w:r>
         <w:rPr>
           <w:rFonts w:cs="Arial"/>
           <w:b/>
           <w:bCs/>
         </w:rPr>
-        <w:t>Usa</w:t>
-      </w:r>
-      <w:proofErr w:type="spellEnd"/>
-      <w:r>
-        <w:rPr>
-          <w:rFonts w:cs="Arial"/>
-          <w:b/>
-          <w:bCs/>
-        </w:rPr>
-        <w:t xml:space="preserve"> El </w:t>
-      </w:r>
-      <w:r>
-        <w:rPr>
-          <w:rFonts w:cs="Arial"/>
-          <w:b/>
-          <w:bCs/>
-        </w:rPr>
-        <w:t xml:space="preserve">Singleton </w:t>
+        <w:t xml:space="preserve"> El Singleton </w:t>
       </w:r>
       <w:proofErr w:type="spellStart"/>
       <w:r>
@@ -6971,24 +6955,6 @@
         </w:rPr>
         <w:t xml:space="preserve"> request.</w:t>
       </w:r>
-    </w:p>
-    <w:p>
-      <w:pPr>
-        <w:spacing w:line="480" w:lineRule="auto"/>
-        <w:ind w:firstLine="720"/>
-        <w:rPr>
-          <w:rFonts w:cs="Arial"/>
-        </w:rPr>
-      </w:pPr>
-    </w:p>
-    <w:p>
-      <w:pPr>
-        <w:spacing w:line="480" w:lineRule="auto"/>
-        <w:ind w:firstLine="720"/>
-        <w:rPr>
-          <w:rFonts w:cs="Arial"/>
-        </w:rPr>
-      </w:pPr>
     </w:p>
     <w:p>
       <w:pPr>
@@ -7712,7 +7678,6 @@
         <w:rPr>
           <w:rFonts w:cs="Arial"/>
         </w:rPr>
-        <w:lastRenderedPageBreak/>
         <w:t>creación</w:t>
       </w:r>
       <w:proofErr w:type="spellEnd"/>
@@ -7834,6 +7799,7 @@
         <w:rPr>
           <w:rFonts w:cs="Arial"/>
         </w:rPr>
+        <w:lastRenderedPageBreak/>
         <w:t>En</w:t>
       </w:r>
       <w:proofErr w:type="spellEnd"/>
@@ -8902,30 +8868,6 @@
     </w:p>
     <w:p>
       <w:pPr>
-        <w:spacing w:line="480" w:lineRule="auto"/>
-        <w:rPr>
-          <w:rFonts w:cs="Arial"/>
-        </w:rPr>
-      </w:pPr>
-    </w:p>
-    <w:p>
-      <w:pPr>
-        <w:spacing w:line="480" w:lineRule="auto"/>
-        <w:rPr>
-          <w:rFonts w:cs="Arial"/>
-        </w:rPr>
-      </w:pPr>
-    </w:p>
-    <w:p>
-      <w:pPr>
-        <w:spacing w:line="480" w:lineRule="auto"/>
-        <w:rPr>
-          <w:rFonts w:cs="Arial"/>
-        </w:rPr>
-      </w:pPr>
-    </w:p>
-    <w:p>
-      <w:pPr>
         <w:pStyle w:val="Prrafodelista"/>
         <w:numPr>
           <w:ilvl w:val="0"/>
@@ -8945,6 +8887,7 @@
           <w:b/>
           <w:bCs/>
         </w:rPr>
+        <w:lastRenderedPageBreak/>
         <w:t>¿</w:t>
       </w:r>
       <w:proofErr w:type="spellStart"/>
@@ -10338,7 +10281,6 @@
         <w:rPr>
           <w:noProof/>
         </w:rPr>
-        <w:lastRenderedPageBreak/>
         <w:drawing>
           <wp:inline distT="0" distB="0" distL="0" distR="0" wp14:anchorId="06DFFD78" wp14:editId="5A0B9DD6">
             <wp:extent cx="5943600" cy="2362200"/>
@@ -10390,6 +10332,7 @@
         <w:rPr>
           <w:rFonts w:cs="Arial"/>
         </w:rPr>
+        <w:lastRenderedPageBreak/>
         <w:t>Cuando</w:t>
       </w:r>
       <w:proofErr w:type="spellEnd"/>
@@ -11564,7 +11507,6 @@
           <w:bCs/>
           <w:noProof/>
         </w:rPr>
-        <w:lastRenderedPageBreak/>
         <w:drawing>
           <wp:inline distT="0" distB="0" distL="0" distR="0" wp14:anchorId="0AB31242" wp14:editId="12D01697">
             <wp:extent cx="5798820" cy="4365840"/>
@@ -11601,16 +11543,6 @@
           </wp:inline>
         </w:drawing>
       </w:r>
-    </w:p>
-    <w:p>
-      <w:pPr>
-        <w:spacing w:line="480" w:lineRule="auto"/>
-        <w:rPr>
-          <w:rFonts w:cs="Arial"/>
-          <w:b/>
-          <w:bCs/>
-        </w:rPr>
-      </w:pPr>
     </w:p>
     <w:p>
       <w:pPr>
@@ -11824,19 +11756,10 @@
     </w:p>
     <w:p>
       <w:pPr>
-        <w:spacing w:line="360" w:lineRule="auto"/>
-        <w:ind w:firstLine="720"/>
-        <w:jc w:val="both"/>
-        <w:rPr>
-          <w:lang w:val="es-CO"/>
-        </w:rPr>
-      </w:pPr>
-    </w:p>
-    <w:p>
-      <w:pPr>
         <w:pStyle w:val="Ttulo1"/>
       </w:pPr>
       <w:r>
+        <w:lastRenderedPageBreak/>
         <w:t>¿</w:t>
       </w:r>
       <w:proofErr w:type="spellStart"/>
@@ -13227,32 +13150,24 @@
           <w:b/>
           <w:bCs/>
         </w:rPr>
-        <w:t>Implementation Del Patron Factory Method</w:t>
-      </w:r>
+        <w:t xml:space="preserve">Implementation Del Patron Factory Method </w:t>
+      </w:r>
+      <w:proofErr w:type="spellStart"/>
       <w:r>
         <w:rPr>
           <w:rFonts w:cs="Arial"/>
           <w:b/>
           <w:bCs/>
         </w:rPr>
-        <w:t xml:space="preserve"> </w:t>
-      </w:r>
-      <w:proofErr w:type="spellStart"/>
+        <w:t>En</w:t>
+      </w:r>
+      <w:proofErr w:type="spellEnd"/>
       <w:r>
         <w:rPr>
           <w:rFonts w:cs="Arial"/>
           <w:b/>
           <w:bCs/>
         </w:rPr>
-        <w:t>En</w:t>
-      </w:r>
-      <w:proofErr w:type="spellEnd"/>
-      <w:r>
-        <w:rPr>
-          <w:rFonts w:cs="Arial"/>
-          <w:b/>
-          <w:bCs/>
-        </w:rPr>
         <w:t xml:space="preserve"> El Proyecto.</w:t>
       </w:r>
     </w:p>
@@ -13732,329 +13647,329 @@
         <w:rPr>
           <w:rFonts w:cs="Arial"/>
         </w:rPr>
+        <w:t>En</w:t>
+      </w:r>
+      <w:proofErr w:type="spellEnd"/>
+      <w:r>
+        <w:rPr>
+          <w:rFonts w:cs="Arial"/>
+        </w:rPr>
+        <w:t xml:space="preserve"> mi </w:t>
+      </w:r>
+      <w:proofErr w:type="spellStart"/>
+      <w:r>
+        <w:rPr>
+          <w:rFonts w:cs="Arial"/>
+        </w:rPr>
+        <w:t>plataforma</w:t>
+      </w:r>
+      <w:proofErr w:type="spellEnd"/>
+      <w:r>
+        <w:rPr>
+          <w:rFonts w:cs="Arial"/>
+        </w:rPr>
+        <w:t xml:space="preserve"> de streaming </w:t>
+      </w:r>
+      <w:proofErr w:type="spellStart"/>
+      <w:r>
+        <w:rPr>
+          <w:rFonts w:cs="Arial"/>
+        </w:rPr>
+        <w:t>utilizo</w:t>
+      </w:r>
+      <w:proofErr w:type="spellEnd"/>
+      <w:r>
+        <w:rPr>
+          <w:rFonts w:cs="Arial"/>
+        </w:rPr>
+        <w:t xml:space="preserve"> </w:t>
+      </w:r>
+      <w:proofErr w:type="spellStart"/>
+      <w:r>
+        <w:rPr>
+          <w:rFonts w:cs="Arial"/>
+        </w:rPr>
+        <w:t>el</w:t>
+      </w:r>
+      <w:proofErr w:type="spellEnd"/>
+      <w:r>
+        <w:rPr>
+          <w:rFonts w:cs="Arial"/>
+        </w:rPr>
+        <w:t xml:space="preserve"> </w:t>
+      </w:r>
+      <w:proofErr w:type="spellStart"/>
+      <w:r>
+        <w:rPr>
+          <w:rFonts w:cs="Arial"/>
+        </w:rPr>
+        <w:t>patrón</w:t>
+      </w:r>
+      <w:proofErr w:type="spellEnd"/>
+      <w:r>
+        <w:rPr>
+          <w:rFonts w:cs="Arial"/>
+        </w:rPr>
+        <w:t xml:space="preserve"> Factory Method para </w:t>
+      </w:r>
+      <w:proofErr w:type="spellStart"/>
+      <w:r>
+        <w:rPr>
+          <w:rFonts w:cs="Arial"/>
+        </w:rPr>
+        <w:t>centralizar</w:t>
+      </w:r>
+      <w:proofErr w:type="spellEnd"/>
+      <w:r>
+        <w:rPr>
+          <w:rFonts w:cs="Arial"/>
+        </w:rPr>
+        <w:t xml:space="preserve"> la </w:t>
+      </w:r>
+      <w:proofErr w:type="spellStart"/>
+      <w:r>
+        <w:rPr>
+          <w:rFonts w:cs="Arial"/>
+        </w:rPr>
+        <w:t>creación</w:t>
+      </w:r>
+      <w:proofErr w:type="spellEnd"/>
+      <w:r>
+        <w:rPr>
+          <w:rFonts w:cs="Arial"/>
+        </w:rPr>
+        <w:t xml:space="preserve"> de las </w:t>
+      </w:r>
+      <w:proofErr w:type="spellStart"/>
+      <w:r>
+        <w:rPr>
+          <w:rFonts w:cs="Arial"/>
+        </w:rPr>
+        <w:t>suscripciones</w:t>
+      </w:r>
+      <w:proofErr w:type="spellEnd"/>
+      <w:r>
+        <w:rPr>
+          <w:rFonts w:cs="Arial"/>
+        </w:rPr>
+        <w:t xml:space="preserve">. </w:t>
+      </w:r>
+      <w:proofErr w:type="spellStart"/>
+      <w:r>
+        <w:rPr>
+          <w:rFonts w:cs="Arial"/>
+        </w:rPr>
+        <w:t>Cuando</w:t>
+      </w:r>
+      <w:proofErr w:type="spellEnd"/>
+      <w:r>
+        <w:rPr>
+          <w:rFonts w:cs="Arial"/>
+        </w:rPr>
+        <w:t xml:space="preserve"> un </w:t>
+      </w:r>
+      <w:proofErr w:type="spellStart"/>
+      <w:r>
+        <w:rPr>
+          <w:rFonts w:cs="Arial"/>
+        </w:rPr>
+        <w:t>usuario</w:t>
+      </w:r>
+      <w:proofErr w:type="spellEnd"/>
+      <w:r>
+        <w:rPr>
+          <w:rFonts w:cs="Arial"/>
+        </w:rPr>
+        <w:t xml:space="preserve"> se </w:t>
+      </w:r>
+      <w:proofErr w:type="spellStart"/>
+      <w:r>
+        <w:rPr>
+          <w:rFonts w:cs="Arial"/>
+        </w:rPr>
+        <w:t>registra</w:t>
+      </w:r>
+      <w:proofErr w:type="spellEnd"/>
+      <w:r>
+        <w:rPr>
+          <w:rFonts w:cs="Arial"/>
+        </w:rPr>
+        <w:t xml:space="preserve">, se le </w:t>
+      </w:r>
+      <w:proofErr w:type="spellStart"/>
+      <w:r>
+        <w:rPr>
+          <w:rFonts w:cs="Arial"/>
+        </w:rPr>
+        <w:t>asigna</w:t>
+      </w:r>
+      <w:proofErr w:type="spellEnd"/>
+      <w:r>
+        <w:rPr>
+          <w:rFonts w:cs="Arial"/>
+        </w:rPr>
+        <w:t xml:space="preserve"> </w:t>
+      </w:r>
+      <w:proofErr w:type="spellStart"/>
+      <w:r>
+        <w:rPr>
+          <w:rFonts w:cs="Arial"/>
+        </w:rPr>
+        <w:t>inicialmente</w:t>
+      </w:r>
+      <w:proofErr w:type="spellEnd"/>
+      <w:r>
+        <w:rPr>
+          <w:rFonts w:cs="Arial"/>
+        </w:rPr>
+        <w:t xml:space="preserve"> </w:t>
+      </w:r>
+      <w:proofErr w:type="spellStart"/>
+      <w:r>
+        <w:rPr>
+          <w:rFonts w:cs="Arial"/>
+        </w:rPr>
+        <w:t>el</w:t>
+      </w:r>
+      <w:proofErr w:type="spellEnd"/>
+      <w:r>
+        <w:rPr>
+          <w:rFonts w:cs="Arial"/>
+        </w:rPr>
+        <w:t xml:space="preserve"> plan Free. </w:t>
+      </w:r>
+      <w:proofErr w:type="spellStart"/>
+      <w:r>
+        <w:rPr>
+          <w:rFonts w:cs="Arial"/>
+        </w:rPr>
+        <w:t>Posteriormente</w:t>
+      </w:r>
+      <w:proofErr w:type="spellEnd"/>
+      <w:r>
+        <w:rPr>
+          <w:rFonts w:cs="Arial"/>
+        </w:rPr>
+        <w:t xml:space="preserve"> </w:t>
+      </w:r>
+      <w:proofErr w:type="spellStart"/>
+      <w:r>
+        <w:rPr>
+          <w:rFonts w:cs="Arial"/>
+        </w:rPr>
+        <w:t>puede</w:t>
+      </w:r>
+      <w:proofErr w:type="spellEnd"/>
+      <w:r>
+        <w:rPr>
+          <w:rFonts w:cs="Arial"/>
+        </w:rPr>
+        <w:t xml:space="preserve"> </w:t>
+      </w:r>
+      <w:proofErr w:type="spellStart"/>
+      <w:r>
+        <w:rPr>
+          <w:rFonts w:cs="Arial"/>
+        </w:rPr>
+        <w:t>cambiar</w:t>
+      </w:r>
+      <w:proofErr w:type="spellEnd"/>
+      <w:r>
+        <w:rPr>
+          <w:rFonts w:cs="Arial"/>
+        </w:rPr>
+        <w:t xml:space="preserve"> de </w:t>
+      </w:r>
+      <w:proofErr w:type="spellStart"/>
+      <w:r>
+        <w:rPr>
+          <w:rFonts w:cs="Arial"/>
+        </w:rPr>
+        <w:t>suscripción</w:t>
+      </w:r>
+      <w:proofErr w:type="spellEnd"/>
+      <w:r>
+        <w:rPr>
+          <w:rFonts w:cs="Arial"/>
+        </w:rPr>
+        <w:t xml:space="preserve">, y la </w:t>
+      </w:r>
+      <w:proofErr w:type="spellStart"/>
+      <w:r>
+        <w:rPr>
+          <w:rFonts w:cs="Arial"/>
+        </w:rPr>
+        <w:t>fábrica</w:t>
+      </w:r>
+      <w:proofErr w:type="spellEnd"/>
+      <w:r>
+        <w:rPr>
+          <w:rFonts w:cs="Arial"/>
+        </w:rPr>
+        <w:t xml:space="preserve"> </w:t>
+      </w:r>
+      <w:proofErr w:type="spellStart"/>
+      <w:r>
+        <w:rPr>
+          <w:rFonts w:cs="Arial"/>
+        </w:rPr>
+        <w:t>permite</w:t>
+      </w:r>
+      <w:proofErr w:type="spellEnd"/>
+      <w:r>
+        <w:rPr>
+          <w:rFonts w:cs="Arial"/>
+        </w:rPr>
+        <w:t xml:space="preserve"> </w:t>
+      </w:r>
+      <w:proofErr w:type="spellStart"/>
+      <w:r>
+        <w:rPr>
+          <w:rFonts w:cs="Arial"/>
+        </w:rPr>
+        <w:t>crear</w:t>
+      </w:r>
+      <w:proofErr w:type="spellEnd"/>
+      <w:r>
+        <w:rPr>
+          <w:rFonts w:cs="Arial"/>
+        </w:rPr>
+        <w:t xml:space="preserve"> </w:t>
+      </w:r>
+      <w:proofErr w:type="spellStart"/>
+      <w:r>
+        <w:rPr>
+          <w:rFonts w:cs="Arial"/>
+        </w:rPr>
+        <w:t>el</w:t>
+      </w:r>
+      <w:proofErr w:type="spellEnd"/>
+      <w:r>
+        <w:rPr>
+          <w:rFonts w:cs="Arial"/>
+        </w:rPr>
+        <w:t xml:space="preserve"> </w:t>
+      </w:r>
+      <w:proofErr w:type="spellStart"/>
+      <w:r>
+        <w:rPr>
+          <w:rFonts w:cs="Arial"/>
+        </w:rPr>
+        <w:t>objeto</w:t>
+      </w:r>
+      <w:proofErr w:type="spellEnd"/>
+      <w:r>
+        <w:rPr>
+          <w:rFonts w:cs="Arial"/>
+        </w:rPr>
+        <w:t xml:space="preserve"> </w:t>
+      </w:r>
+      <w:proofErr w:type="spellStart"/>
+      <w:r>
+        <w:rPr>
+          <w:rFonts w:cs="Arial"/>
+        </w:rPr>
         <w:lastRenderedPageBreak/>
-        <w:t>En</w:t>
-      </w:r>
-      <w:proofErr w:type="spellEnd"/>
-      <w:r>
-        <w:rPr>
-          <w:rFonts w:cs="Arial"/>
-        </w:rPr>
-        <w:t xml:space="preserve"> mi </w:t>
-      </w:r>
-      <w:proofErr w:type="spellStart"/>
-      <w:r>
-        <w:rPr>
-          <w:rFonts w:cs="Arial"/>
-        </w:rPr>
-        <w:t>plataforma</w:t>
-      </w:r>
-      <w:proofErr w:type="spellEnd"/>
-      <w:r>
-        <w:rPr>
-          <w:rFonts w:cs="Arial"/>
-        </w:rPr>
-        <w:t xml:space="preserve"> de streaming </w:t>
-      </w:r>
-      <w:proofErr w:type="spellStart"/>
-      <w:r>
-        <w:rPr>
-          <w:rFonts w:cs="Arial"/>
-        </w:rPr>
-        <w:t>utilizo</w:t>
-      </w:r>
-      <w:proofErr w:type="spellEnd"/>
-      <w:r>
-        <w:rPr>
-          <w:rFonts w:cs="Arial"/>
-        </w:rPr>
-        <w:t xml:space="preserve"> </w:t>
-      </w:r>
-      <w:proofErr w:type="spellStart"/>
-      <w:r>
-        <w:rPr>
-          <w:rFonts w:cs="Arial"/>
-        </w:rPr>
-        <w:t>el</w:t>
-      </w:r>
-      <w:proofErr w:type="spellEnd"/>
-      <w:r>
-        <w:rPr>
-          <w:rFonts w:cs="Arial"/>
-        </w:rPr>
-        <w:t xml:space="preserve"> </w:t>
-      </w:r>
-      <w:proofErr w:type="spellStart"/>
-      <w:r>
-        <w:rPr>
-          <w:rFonts w:cs="Arial"/>
-        </w:rPr>
-        <w:t>patrón</w:t>
-      </w:r>
-      <w:proofErr w:type="spellEnd"/>
-      <w:r>
-        <w:rPr>
-          <w:rFonts w:cs="Arial"/>
-        </w:rPr>
-        <w:t xml:space="preserve"> Factory Method para </w:t>
-      </w:r>
-      <w:proofErr w:type="spellStart"/>
-      <w:r>
-        <w:rPr>
-          <w:rFonts w:cs="Arial"/>
-        </w:rPr>
-        <w:t>centralizar</w:t>
-      </w:r>
-      <w:proofErr w:type="spellEnd"/>
-      <w:r>
-        <w:rPr>
-          <w:rFonts w:cs="Arial"/>
-        </w:rPr>
-        <w:t xml:space="preserve"> la </w:t>
-      </w:r>
-      <w:proofErr w:type="spellStart"/>
-      <w:r>
-        <w:rPr>
-          <w:rFonts w:cs="Arial"/>
-        </w:rPr>
-        <w:t>creación</w:t>
-      </w:r>
-      <w:proofErr w:type="spellEnd"/>
-      <w:r>
-        <w:rPr>
-          <w:rFonts w:cs="Arial"/>
-        </w:rPr>
-        <w:t xml:space="preserve"> de las </w:t>
-      </w:r>
-      <w:proofErr w:type="spellStart"/>
-      <w:r>
-        <w:rPr>
-          <w:rFonts w:cs="Arial"/>
-        </w:rPr>
-        <w:t>suscripciones</w:t>
-      </w:r>
-      <w:proofErr w:type="spellEnd"/>
-      <w:r>
-        <w:rPr>
-          <w:rFonts w:cs="Arial"/>
-        </w:rPr>
-        <w:t xml:space="preserve">. </w:t>
-      </w:r>
-      <w:proofErr w:type="spellStart"/>
-      <w:r>
-        <w:rPr>
-          <w:rFonts w:cs="Arial"/>
-        </w:rPr>
-        <w:t>Cuando</w:t>
-      </w:r>
-      <w:proofErr w:type="spellEnd"/>
-      <w:r>
-        <w:rPr>
-          <w:rFonts w:cs="Arial"/>
-        </w:rPr>
-        <w:t xml:space="preserve"> un </w:t>
-      </w:r>
-      <w:proofErr w:type="spellStart"/>
-      <w:r>
-        <w:rPr>
-          <w:rFonts w:cs="Arial"/>
-        </w:rPr>
-        <w:t>usuario</w:t>
-      </w:r>
-      <w:proofErr w:type="spellEnd"/>
-      <w:r>
-        <w:rPr>
-          <w:rFonts w:cs="Arial"/>
-        </w:rPr>
-        <w:t xml:space="preserve"> se </w:t>
-      </w:r>
-      <w:proofErr w:type="spellStart"/>
-      <w:r>
-        <w:rPr>
-          <w:rFonts w:cs="Arial"/>
-        </w:rPr>
-        <w:t>registra</w:t>
-      </w:r>
-      <w:proofErr w:type="spellEnd"/>
-      <w:r>
-        <w:rPr>
-          <w:rFonts w:cs="Arial"/>
-        </w:rPr>
-        <w:t xml:space="preserve">, se le </w:t>
-      </w:r>
-      <w:proofErr w:type="spellStart"/>
-      <w:r>
-        <w:rPr>
-          <w:rFonts w:cs="Arial"/>
-        </w:rPr>
-        <w:t>asigna</w:t>
-      </w:r>
-      <w:proofErr w:type="spellEnd"/>
-      <w:r>
-        <w:rPr>
-          <w:rFonts w:cs="Arial"/>
-        </w:rPr>
-        <w:t xml:space="preserve"> </w:t>
-      </w:r>
-      <w:proofErr w:type="spellStart"/>
-      <w:r>
-        <w:rPr>
-          <w:rFonts w:cs="Arial"/>
-        </w:rPr>
-        <w:t>inicialmente</w:t>
-      </w:r>
-      <w:proofErr w:type="spellEnd"/>
-      <w:r>
-        <w:rPr>
-          <w:rFonts w:cs="Arial"/>
-        </w:rPr>
-        <w:t xml:space="preserve"> </w:t>
-      </w:r>
-      <w:proofErr w:type="spellStart"/>
-      <w:r>
-        <w:rPr>
-          <w:rFonts w:cs="Arial"/>
-        </w:rPr>
-        <w:t>el</w:t>
-      </w:r>
-      <w:proofErr w:type="spellEnd"/>
-      <w:r>
-        <w:rPr>
-          <w:rFonts w:cs="Arial"/>
-        </w:rPr>
-        <w:t xml:space="preserve"> plan Free. </w:t>
-      </w:r>
-      <w:proofErr w:type="spellStart"/>
-      <w:r>
-        <w:rPr>
-          <w:rFonts w:cs="Arial"/>
-        </w:rPr>
-        <w:t>Posteriormente</w:t>
-      </w:r>
-      <w:proofErr w:type="spellEnd"/>
-      <w:r>
-        <w:rPr>
-          <w:rFonts w:cs="Arial"/>
-        </w:rPr>
-        <w:t xml:space="preserve"> </w:t>
-      </w:r>
-      <w:proofErr w:type="spellStart"/>
-      <w:r>
-        <w:rPr>
-          <w:rFonts w:cs="Arial"/>
-        </w:rPr>
-        <w:t>puede</w:t>
-      </w:r>
-      <w:proofErr w:type="spellEnd"/>
-      <w:r>
-        <w:rPr>
-          <w:rFonts w:cs="Arial"/>
-        </w:rPr>
-        <w:t xml:space="preserve"> </w:t>
-      </w:r>
-      <w:proofErr w:type="spellStart"/>
-      <w:r>
-        <w:rPr>
-          <w:rFonts w:cs="Arial"/>
-        </w:rPr>
-        <w:t>cambiar</w:t>
-      </w:r>
-      <w:proofErr w:type="spellEnd"/>
-      <w:r>
-        <w:rPr>
-          <w:rFonts w:cs="Arial"/>
-        </w:rPr>
-        <w:t xml:space="preserve"> de </w:t>
-      </w:r>
-      <w:proofErr w:type="spellStart"/>
-      <w:r>
-        <w:rPr>
-          <w:rFonts w:cs="Arial"/>
-        </w:rPr>
-        <w:t>suscripción</w:t>
-      </w:r>
-      <w:proofErr w:type="spellEnd"/>
-      <w:r>
-        <w:rPr>
-          <w:rFonts w:cs="Arial"/>
-        </w:rPr>
-        <w:t xml:space="preserve">, y la </w:t>
-      </w:r>
-      <w:proofErr w:type="spellStart"/>
-      <w:r>
-        <w:rPr>
-          <w:rFonts w:cs="Arial"/>
-        </w:rPr>
-        <w:t>fábrica</w:t>
-      </w:r>
-      <w:proofErr w:type="spellEnd"/>
-      <w:r>
-        <w:rPr>
-          <w:rFonts w:cs="Arial"/>
-        </w:rPr>
-        <w:t xml:space="preserve"> </w:t>
-      </w:r>
-      <w:proofErr w:type="spellStart"/>
-      <w:r>
-        <w:rPr>
-          <w:rFonts w:cs="Arial"/>
-        </w:rPr>
-        <w:t>permite</w:t>
-      </w:r>
-      <w:proofErr w:type="spellEnd"/>
-      <w:r>
-        <w:rPr>
-          <w:rFonts w:cs="Arial"/>
-        </w:rPr>
-        <w:t xml:space="preserve"> </w:t>
-      </w:r>
-      <w:proofErr w:type="spellStart"/>
-      <w:r>
-        <w:rPr>
-          <w:rFonts w:cs="Arial"/>
-        </w:rPr>
-        <w:t>crear</w:t>
-      </w:r>
-      <w:proofErr w:type="spellEnd"/>
-      <w:r>
-        <w:rPr>
-          <w:rFonts w:cs="Arial"/>
-        </w:rPr>
-        <w:t xml:space="preserve"> </w:t>
-      </w:r>
-      <w:proofErr w:type="spellStart"/>
-      <w:r>
-        <w:rPr>
-          <w:rFonts w:cs="Arial"/>
-        </w:rPr>
-        <w:t>el</w:t>
-      </w:r>
-      <w:proofErr w:type="spellEnd"/>
-      <w:r>
-        <w:rPr>
-          <w:rFonts w:cs="Arial"/>
-        </w:rPr>
-        <w:t xml:space="preserve"> </w:t>
-      </w:r>
-      <w:proofErr w:type="spellStart"/>
-      <w:r>
-        <w:rPr>
-          <w:rFonts w:cs="Arial"/>
-        </w:rPr>
-        <w:t>objeto</w:t>
-      </w:r>
-      <w:proofErr w:type="spellEnd"/>
-      <w:r>
-        <w:rPr>
-          <w:rFonts w:cs="Arial"/>
-        </w:rPr>
-        <w:t xml:space="preserve"> </w:t>
-      </w:r>
-      <w:proofErr w:type="spellStart"/>
-      <w:r>
-        <w:rPr>
-          <w:rFonts w:cs="Arial"/>
-        </w:rPr>
         <w:t>correspondiente</w:t>
       </w:r>
       <w:proofErr w:type="spellEnd"/>
@@ -15899,7 +15814,6 @@
         <w:rPr>
           <w:rFonts w:cs="Arial"/>
         </w:rPr>
-        <w:lastRenderedPageBreak/>
         <w:t xml:space="preserve">FreePlan.js, BasicoPlan.js, PremiumPlan.js, FamiliarPlan.js (los 4 planes </w:t>
       </w:r>
       <w:proofErr w:type="spellStart"/>
@@ -16232,6 +16146,7 @@
           <w:b/>
           <w:bCs/>
         </w:rPr>
+        <w:lastRenderedPageBreak/>
         <w:t>Cuando</w:t>
       </w:r>
       <w:proofErr w:type="spellEnd"/>
@@ -17469,16 +17384,6 @@
         <w:jc w:val="center"/>
         <w:rPr>
           <w:rFonts w:cs="Arial"/>
-        </w:rPr>
-      </w:pPr>
-    </w:p>
-    <w:p>
-      <w:pPr>
-        <w:spacing w:line="480" w:lineRule="auto"/>
-        <w:ind w:firstLine="720"/>
-        <w:jc w:val="center"/>
-        <w:rPr>
-          <w:rFonts w:cs="Arial"/>
           <w:b/>
           <w:bCs/>
         </w:rPr>
@@ -17490,17 +17395,17 @@
         </w:rPr>
         <w:lastRenderedPageBreak/>
         <w:drawing>
-          <wp:anchor distT="0" distB="0" distL="114300" distR="114300" simplePos="0" relativeHeight="251663360" behindDoc="0" locked="0" layoutInCell="1" allowOverlap="1" wp14:anchorId="358736B1" wp14:editId="1F4A070F">
+          <wp:anchor distT="0" distB="0" distL="114300" distR="114300" simplePos="0" relativeHeight="251663360" behindDoc="0" locked="0" layoutInCell="1" allowOverlap="1" wp14:anchorId="358736B1" wp14:editId="0FBACCF9">
             <wp:simplePos x="0" y="0"/>
             <wp:positionH relativeFrom="margin">
               <wp:align>center</wp:align>
             </wp:positionH>
             <wp:positionV relativeFrom="paragraph">
-              <wp:posOffset>396240</wp:posOffset>
+              <wp:posOffset>394335</wp:posOffset>
             </wp:positionV>
             <wp:extent cx="5264785" cy="4518660"/>
-            <wp:effectExtent l="0" t="0" r="0" b="0"/>
-            <wp:wrapSquare wrapText="bothSides"/>
+            <wp:effectExtent l="0" t="0" r="8890" b="0"/>
+            <wp:wrapTopAndBottom/>
             <wp:docPr id="7" name="Imagen 7"/>
             <wp:cNvGraphicFramePr>
               <a:graphicFrameLocks xmlns:a="http://schemas.openxmlformats.org/drawingml/2006/main" noChangeAspect="1"/>
@@ -17601,16 +17506,6 @@
       <w:pPr>
         <w:spacing w:line="480" w:lineRule="auto"/>
         <w:ind w:firstLine="720"/>
-        <w:jc w:val="center"/>
-        <w:rPr>
-          <w:rFonts w:cs="Arial"/>
-        </w:rPr>
-      </w:pPr>
-    </w:p>
-    <w:p>
-      <w:pPr>
-        <w:spacing w:line="480" w:lineRule="auto"/>
-        <w:ind w:firstLine="720"/>
         <w:rPr>
           <w:rFonts w:cs="Arial"/>
           <w:b/>
@@ -18068,17 +17963,9 @@
         </w:rPr>
         <w:lastRenderedPageBreak/>
         <w:drawing>
-          <wp:anchor distT="0" distB="0" distL="114300" distR="114300" simplePos="0" relativeHeight="251664384" behindDoc="0" locked="0" layoutInCell="1" allowOverlap="1" wp14:anchorId="75FD8D5B" wp14:editId="1B24E422">
-            <wp:simplePos x="0" y="0"/>
-            <wp:positionH relativeFrom="margin">
-              <wp:align>right</wp:align>
-            </wp:positionH>
-            <wp:positionV relativeFrom="paragraph">
-              <wp:posOffset>0</wp:posOffset>
-            </wp:positionV>
-            <wp:extent cx="5943600" cy="5433695"/>
-            <wp:effectExtent l="0" t="0" r="0" b="0"/>
-            <wp:wrapSquare wrapText="bothSides"/>
+          <wp:inline distT="0" distB="0" distL="0" distR="0" wp14:anchorId="75FD8D5B" wp14:editId="3A25F1EA">
+            <wp:extent cx="4973781" cy="4547093"/>
+            <wp:effectExtent l="0" t="0" r="0" b="6350"/>
             <wp:docPr id="9" name="Imagen 9"/>
             <wp:cNvGraphicFramePr>
               <a:graphicFrameLocks xmlns:a="http://schemas.openxmlformats.org/drawingml/2006/main" noChangeAspect="1"/>
@@ -18105,7 +17992,7 @@
                   <pic:spPr>
                     <a:xfrm>
                       <a:off x="0" y="0"/>
-                      <a:ext cx="5943600" cy="5433695"/>
+                      <a:ext cx="4981222" cy="4553896"/>
                     </a:xfrm>
                     <a:prstGeom prst="rect">
                       <a:avLst/>
@@ -18114,7 +18001,7 @@
                 </pic:pic>
               </a:graphicData>
             </a:graphic>
-          </wp:anchor>
+          </wp:inline>
         </w:drawing>
       </w:r>
     </w:p>
@@ -18572,7 +18459,6 @@
           <w:rFonts w:cs="Arial"/>
           <w:noProof/>
         </w:rPr>
-        <w:lastRenderedPageBreak/>
         <w:drawing>
           <wp:anchor distT="0" distB="0" distL="114300" distR="114300" simplePos="0" relativeHeight="251665408" behindDoc="0" locked="0" layoutInCell="1" allowOverlap="1" wp14:anchorId="71509A6E" wp14:editId="3C416300">
             <wp:simplePos x="0" y="0"/>
@@ -18668,10 +18554,11 @@
           <w:rFonts w:cs="Arial"/>
           <w:noProof/>
         </w:rPr>
+        <w:lastRenderedPageBreak/>
         <w:drawing>
-          <wp:inline distT="0" distB="0" distL="0" distR="0" wp14:anchorId="337FC65A" wp14:editId="47E92BE2">
-            <wp:extent cx="3954780" cy="4722125"/>
-            <wp:effectExtent l="0" t="0" r="7620" b="2540"/>
+          <wp:inline distT="0" distB="0" distL="0" distR="0" wp14:anchorId="337FC65A" wp14:editId="157DF0BF">
+            <wp:extent cx="3214255" cy="3837916"/>
+            <wp:effectExtent l="0" t="0" r="5715" b="0"/>
             <wp:docPr id="16" name="Imagen 16"/>
             <wp:cNvGraphicFramePr>
               <a:graphicFrameLocks xmlns:a="http://schemas.openxmlformats.org/drawingml/2006/main" noChangeAspect="1"/>
@@ -18692,7 +18579,7 @@
                   <pic:spPr>
                     <a:xfrm>
                       <a:off x="0" y="0"/>
-                      <a:ext cx="3954780" cy="4722125"/>
+                      <a:ext cx="3224805" cy="3850513"/>
                     </a:xfrm>
                     <a:prstGeom prst="rect">
                       <a:avLst/>
@@ -18707,34 +18594,6 @@
     </w:p>
     <w:p>
       <w:pPr>
-        <w:spacing w:line="480" w:lineRule="auto"/>
-        <w:ind w:firstLine="720"/>
-        <w:jc w:val="center"/>
-        <w:rPr>
-          <w:rFonts w:cs="Arial"/>
-        </w:rPr>
-      </w:pPr>
-    </w:p>
-    <w:p>
-      <w:pPr>
-        <w:spacing w:line="480" w:lineRule="auto"/>
-        <w:ind w:firstLine="720"/>
-        <w:jc w:val="center"/>
-        <w:rPr>
-          <w:rFonts w:cs="Arial"/>
-        </w:rPr>
-      </w:pPr>
-    </w:p>
-    <w:p>
-      <w:pPr>
-        <w:spacing w:line="480" w:lineRule="auto"/>
-        <w:rPr>
-          <w:rFonts w:cs="Arial"/>
-        </w:rPr>
-      </w:pPr>
-    </w:p>
-    <w:p>
-      <w:pPr>
         <w:pStyle w:val="Prrafodelista"/>
         <w:numPr>
           <w:ilvl w:val="0"/>
@@ -18750,110 +18609,20 @@
       <w:r>
         <w:rPr>
           <w:rFonts w:cs="Arial"/>
-          <w:b/>
-          <w:bCs/>
-        </w:rPr>
-        <w:lastRenderedPageBreak/>
-        <w:t xml:space="preserve"> El Factory Method </w:t>
-      </w:r>
-      <w:proofErr w:type="spellStart"/>
-      <w:r>
-        <w:rPr>
-          <w:rFonts w:cs="Arial"/>
-          <w:b/>
-          <w:bCs/>
-        </w:rPr>
-        <w:t>en</w:t>
-      </w:r>
-      <w:proofErr w:type="spellEnd"/>
-      <w:r>
-        <w:rPr>
-          <w:rFonts w:cs="Arial"/>
-          <w:b/>
-          <w:bCs/>
-        </w:rPr>
-        <w:t xml:space="preserve"> </w:t>
-      </w:r>
-      <w:proofErr w:type="spellStart"/>
-      <w:r>
-        <w:rPr>
-          <w:rFonts w:cs="Arial"/>
-          <w:b/>
-          <w:bCs/>
-        </w:rPr>
-        <w:t>sí</w:t>
-      </w:r>
-      <w:proofErr w:type="spellEnd"/>
-      <w:r>
-        <w:rPr>
-          <w:rFonts w:cs="Arial"/>
-          <w:b/>
-          <w:bCs/>
-        </w:rPr>
-        <w:t xml:space="preserve"> </w:t>
-      </w:r>
-      <w:proofErr w:type="spellStart"/>
-      <w:r>
-        <w:rPr>
-          <w:rFonts w:cs="Arial"/>
-          <w:b/>
-          <w:bCs/>
-        </w:rPr>
-        <w:t>PlanFactory.crearPlan</w:t>
-      </w:r>
-      <w:proofErr w:type="spellEnd"/>
-      <w:r>
-        <w:rPr>
-          <w:rFonts w:cs="Arial"/>
-          <w:b/>
-          <w:bCs/>
-        </w:rPr>
-        <w:t>(</w:t>
-      </w:r>
-      <w:proofErr w:type="spellStart"/>
-      <w:r>
-        <w:rPr>
-          <w:rFonts w:cs="Arial"/>
-          <w:b/>
-          <w:bCs/>
-        </w:rPr>
-        <w:t>tipo</w:t>
-      </w:r>
-      <w:proofErr w:type="spellEnd"/>
-      <w:r>
-        <w:rPr>
-          <w:rFonts w:cs="Arial"/>
-          <w:b/>
-          <w:bCs/>
-        </w:rPr>
-        <w:t>)</w:t>
-      </w:r>
-    </w:p>
-    <w:p>
-      <w:pPr>
-        <w:spacing w:line="480" w:lineRule="auto"/>
-        <w:ind w:firstLine="720"/>
-        <w:rPr>
-          <w:rFonts w:cs="Arial"/>
-        </w:rPr>
-      </w:pPr>
-      <w:r>
-        <w:rPr>
-          <w:rFonts w:cs="Arial"/>
           <w:noProof/>
         </w:rPr>
         <w:drawing>
-          <wp:anchor distT="0" distB="0" distL="114300" distR="114300" simplePos="0" relativeHeight="251666432" behindDoc="0" locked="0" layoutInCell="1" allowOverlap="1" wp14:anchorId="574557FD" wp14:editId="1A4D6B6A">
+          <wp:anchor distT="0" distB="0" distL="114300" distR="114300" simplePos="0" relativeHeight="251673600" behindDoc="0" locked="0" layoutInCell="1" allowOverlap="1" wp14:anchorId="574557FD" wp14:editId="702A6A69">
             <wp:simplePos x="0" y="0"/>
             <wp:positionH relativeFrom="margin">
-              <wp:align>right</wp:align>
+              <wp:align>center</wp:align>
             </wp:positionH>
-            <wp:positionV relativeFrom="paragraph">
-              <wp:posOffset>1276350</wp:posOffset>
+            <wp:positionV relativeFrom="page">
+              <wp:posOffset>5340465</wp:posOffset>
             </wp:positionV>
-            <wp:extent cx="5943600" cy="4364355"/>
-            <wp:effectExtent l="0" t="0" r="0" b="0"/>
-            <wp:wrapSquare wrapText="bothSides"/>
+            <wp:extent cx="4793615" cy="3519805"/>
+            <wp:effectExtent l="0" t="0" r="6985" b="4445"/>
+            <wp:wrapTopAndBottom/>
             <wp:docPr id="17" name="Imagen 17"/>
             <wp:cNvGraphicFramePr>
               <a:graphicFrameLocks xmlns:a="http://schemas.openxmlformats.org/drawingml/2006/main" noChangeAspect="1"/>
@@ -18880,7 +18649,7 @@
                   <pic:spPr>
                     <a:xfrm>
                       <a:off x="0" y="0"/>
-                      <a:ext cx="5943600" cy="4364355"/>
+                      <a:ext cx="4793615" cy="3519805"/>
                     </a:xfrm>
                     <a:prstGeom prst="rect">
                       <a:avLst/>
@@ -18889,293 +18658,83 @@
                 </pic:pic>
               </a:graphicData>
             </a:graphic>
+            <wp14:sizeRelH relativeFrom="margin">
+              <wp14:pctWidth>0</wp14:pctWidth>
+            </wp14:sizeRelH>
+            <wp14:sizeRelV relativeFrom="margin">
+              <wp14:pctHeight>0</wp14:pctHeight>
+            </wp14:sizeRelV>
           </wp:anchor>
         </w:drawing>
       </w:r>
-      <w:proofErr w:type="spellStart"/>
-      <w:r>
-        <w:rPr>
-          <w:rFonts w:cs="Arial"/>
-        </w:rPr>
-        <w:t>Est</w:t>
-      </w:r>
-      <w:r>
-        <w:rPr>
-          <w:rFonts w:cs="Arial"/>
-        </w:rPr>
-        <w:t>o</w:t>
-      </w:r>
-      <w:proofErr w:type="spellEnd"/>
-      <w:r>
-        <w:rPr>
-          <w:rFonts w:cs="Arial"/>
-        </w:rPr>
-        <w:t xml:space="preserve"> es lo </w:t>
-      </w:r>
-      <w:proofErr w:type="spellStart"/>
-      <w:r>
-        <w:rPr>
-          <w:rFonts w:cs="Arial"/>
-        </w:rPr>
-        <w:t>más</w:t>
-      </w:r>
-      <w:proofErr w:type="spellEnd"/>
-      <w:r>
-        <w:rPr>
-          <w:rFonts w:cs="Arial"/>
-        </w:rPr>
-        <w:t xml:space="preserve"> </w:t>
-      </w:r>
-      <w:proofErr w:type="spellStart"/>
-      <w:r>
-        <w:rPr>
-          <w:rFonts w:cs="Arial"/>
-        </w:rPr>
-        <w:t>importante</w:t>
-      </w:r>
-      <w:proofErr w:type="spellEnd"/>
-      <w:r>
-        <w:rPr>
-          <w:rFonts w:cs="Arial"/>
-        </w:rPr>
-        <w:t xml:space="preserve"> del </w:t>
-      </w:r>
-      <w:proofErr w:type="spellStart"/>
-      <w:r>
-        <w:rPr>
-          <w:rFonts w:cs="Arial"/>
-        </w:rPr>
-        <w:t>patrón</w:t>
-      </w:r>
-      <w:proofErr w:type="spellEnd"/>
-      <w:r>
-        <w:rPr>
-          <w:rFonts w:cs="Arial"/>
-        </w:rPr>
-        <w:t xml:space="preserve">. Es </w:t>
-      </w:r>
-      <w:proofErr w:type="spellStart"/>
-      <w:r>
-        <w:rPr>
-          <w:rFonts w:cs="Arial"/>
-        </w:rPr>
-        <w:t>el</w:t>
-      </w:r>
-      <w:proofErr w:type="spellEnd"/>
-      <w:r>
-        <w:rPr>
-          <w:rFonts w:cs="Arial"/>
-        </w:rPr>
-        <w:t xml:space="preserve"> </w:t>
-      </w:r>
-      <w:proofErr w:type="spellStart"/>
-      <w:r>
-        <w:rPr>
-          <w:rFonts w:cs="Arial"/>
-        </w:rPr>
-        <w:t>único</w:t>
-      </w:r>
-      <w:proofErr w:type="spellEnd"/>
-      <w:r>
-        <w:rPr>
-          <w:rFonts w:cs="Arial"/>
-        </w:rPr>
-        <w:t xml:space="preserve"> </w:t>
-      </w:r>
-      <w:proofErr w:type="spellStart"/>
-      <w:r>
-        <w:rPr>
-          <w:rFonts w:cs="Arial"/>
-        </w:rPr>
-        <w:t>lugar</w:t>
-      </w:r>
-      <w:proofErr w:type="spellEnd"/>
-      <w:r>
-        <w:rPr>
-          <w:rFonts w:cs="Arial"/>
-        </w:rPr>
-        <w:t xml:space="preserve"> del </w:t>
-      </w:r>
-      <w:proofErr w:type="spellStart"/>
-      <w:r>
-        <w:rPr>
-          <w:rFonts w:cs="Arial"/>
-        </w:rPr>
-        <w:t>sistema</w:t>
-      </w:r>
-      <w:proofErr w:type="spellEnd"/>
-      <w:r>
-        <w:rPr>
-          <w:rFonts w:cs="Arial"/>
-        </w:rPr>
-        <w:t xml:space="preserve"> </w:t>
-      </w:r>
-      <w:proofErr w:type="spellStart"/>
-      <w:r>
-        <w:rPr>
-          <w:rFonts w:cs="Arial"/>
-        </w:rPr>
-        <w:t>donde</w:t>
-      </w:r>
-      <w:proofErr w:type="spellEnd"/>
-      <w:r>
-        <w:rPr>
-          <w:rFonts w:cs="Arial"/>
-        </w:rPr>
-        <w:t xml:space="preserve"> </w:t>
-      </w:r>
-      <w:proofErr w:type="spellStart"/>
-      <w:r>
-        <w:rPr>
-          <w:rFonts w:cs="Arial"/>
-        </w:rPr>
-        <w:t>aparece</w:t>
-      </w:r>
-      <w:proofErr w:type="spellEnd"/>
-      <w:r>
-        <w:rPr>
-          <w:rFonts w:cs="Arial"/>
-        </w:rPr>
-        <w:t xml:space="preserve"> new </w:t>
-      </w:r>
-      <w:proofErr w:type="spellStart"/>
-      <w:proofErr w:type="gramStart"/>
-      <w:r>
-        <w:rPr>
-          <w:rFonts w:cs="Arial"/>
-        </w:rPr>
-        <w:t>FreePlan</w:t>
-      </w:r>
-      <w:proofErr w:type="spellEnd"/>
-      <w:r>
-        <w:rPr>
-          <w:rFonts w:cs="Arial"/>
+      <w:r>
+        <w:rPr>
+          <w:rFonts w:cs="Arial"/>
+          <w:b/>
+          <w:bCs/>
+        </w:rPr>
+        <w:t xml:space="preserve"> El Factory Method </w:t>
+      </w:r>
+      <w:proofErr w:type="spellStart"/>
+      <w:r>
+        <w:rPr>
+          <w:rFonts w:cs="Arial"/>
+          <w:b/>
+          <w:bCs/>
+        </w:rPr>
+        <w:t>en</w:t>
+      </w:r>
+      <w:proofErr w:type="spellEnd"/>
+      <w:r>
+        <w:rPr>
+          <w:rFonts w:cs="Arial"/>
+          <w:b/>
+          <w:bCs/>
+        </w:rPr>
+        <w:t xml:space="preserve"> </w:t>
+      </w:r>
+      <w:proofErr w:type="spellStart"/>
+      <w:r>
+        <w:rPr>
+          <w:rFonts w:cs="Arial"/>
+          <w:b/>
+          <w:bCs/>
+        </w:rPr>
+        <w:t>sí</w:t>
+      </w:r>
+      <w:proofErr w:type="spellEnd"/>
+      <w:r>
+        <w:rPr>
+          <w:rFonts w:cs="Arial"/>
+          <w:b/>
+          <w:bCs/>
+        </w:rPr>
+        <w:t xml:space="preserve"> </w:t>
+      </w:r>
+      <w:proofErr w:type="spellStart"/>
+      <w:r>
+        <w:rPr>
+          <w:rFonts w:cs="Arial"/>
+          <w:b/>
+          <w:bCs/>
+        </w:rPr>
+        <w:t>PlanFactory.crearPlan</w:t>
+      </w:r>
+      <w:proofErr w:type="spellEnd"/>
+      <w:r>
+        <w:rPr>
+          <w:rFonts w:cs="Arial"/>
+          <w:b/>
+          <w:bCs/>
         </w:rPr>
         <w:t>(</w:t>
       </w:r>
-      <w:proofErr w:type="gramEnd"/>
-      <w:r>
-        <w:rPr>
-          <w:rFonts w:cs="Arial"/>
-        </w:rPr>
-        <w:t xml:space="preserve">), new </w:t>
-      </w:r>
-      <w:proofErr w:type="spellStart"/>
-      <w:r>
-        <w:rPr>
-          <w:rFonts w:cs="Arial"/>
-        </w:rPr>
-        <w:t>BasicoPlan</w:t>
-      </w:r>
-      <w:proofErr w:type="spellEnd"/>
-      <w:r>
-        <w:rPr>
-          <w:rFonts w:cs="Arial"/>
-        </w:rPr>
-        <w:t xml:space="preserve">(), etc. </w:t>
-      </w:r>
-      <w:proofErr w:type="spellStart"/>
-      <w:r>
-        <w:rPr>
-          <w:rFonts w:cs="Arial"/>
-        </w:rPr>
-        <w:t>Recibe</w:t>
-      </w:r>
-      <w:proofErr w:type="spellEnd"/>
-      <w:r>
-        <w:rPr>
-          <w:rFonts w:cs="Arial"/>
-        </w:rPr>
-        <w:t xml:space="preserve"> un string ('free', '</w:t>
-      </w:r>
-      <w:proofErr w:type="spellStart"/>
-      <w:r>
-        <w:rPr>
-          <w:rFonts w:cs="Arial"/>
-        </w:rPr>
-        <w:t>basico</w:t>
-      </w:r>
-      <w:proofErr w:type="spellEnd"/>
-      <w:r>
-        <w:rPr>
-          <w:rFonts w:cs="Arial"/>
-        </w:rPr>
-        <w:t xml:space="preserve">', 'premium', 'familiar'), </w:t>
-      </w:r>
-      <w:proofErr w:type="spellStart"/>
-      <w:r>
-        <w:rPr>
-          <w:rFonts w:cs="Arial"/>
-        </w:rPr>
-        <w:t>hace</w:t>
-      </w:r>
-      <w:proofErr w:type="spellEnd"/>
-      <w:r>
-        <w:rPr>
-          <w:rFonts w:cs="Arial"/>
-        </w:rPr>
-        <w:t xml:space="preserve"> un switch, y </w:t>
-      </w:r>
-      <w:proofErr w:type="spellStart"/>
-      <w:r>
-        <w:rPr>
-          <w:rFonts w:cs="Arial"/>
-        </w:rPr>
-        <w:t>devuelve</w:t>
-      </w:r>
-      <w:proofErr w:type="spellEnd"/>
-      <w:r>
-        <w:rPr>
-          <w:rFonts w:cs="Arial"/>
-        </w:rPr>
-        <w:t xml:space="preserve"> la </w:t>
-      </w:r>
-      <w:proofErr w:type="spellStart"/>
-      <w:r>
-        <w:rPr>
-          <w:rFonts w:cs="Arial"/>
-        </w:rPr>
-        <w:t>instancia</w:t>
-      </w:r>
-      <w:proofErr w:type="spellEnd"/>
-      <w:r>
-        <w:rPr>
-          <w:rFonts w:cs="Arial"/>
-        </w:rPr>
-        <w:t xml:space="preserve"> </w:t>
-      </w:r>
-      <w:proofErr w:type="spellStart"/>
-      <w:r>
-        <w:rPr>
-          <w:rFonts w:cs="Arial"/>
-        </w:rPr>
-        <w:t>correspondiente</w:t>
-      </w:r>
-      <w:proofErr w:type="spellEnd"/>
-      <w:r>
-        <w:rPr>
-          <w:rFonts w:cs="Arial"/>
-        </w:rPr>
-        <w:t xml:space="preserve">. Si </w:t>
-      </w:r>
-      <w:proofErr w:type="spellStart"/>
-      <w:r>
-        <w:rPr>
-          <w:rFonts w:cs="Arial"/>
-        </w:rPr>
-        <w:t>el</w:t>
-      </w:r>
-      <w:proofErr w:type="spellEnd"/>
-      <w:r>
-        <w:rPr>
-          <w:rFonts w:cs="Arial"/>
-        </w:rPr>
-        <w:t xml:space="preserve"> </w:t>
-      </w:r>
-      <w:proofErr w:type="spellStart"/>
-      <w:r>
-        <w:rPr>
-          <w:rFonts w:cs="Arial"/>
+      <w:proofErr w:type="spellStart"/>
+      <w:r>
+        <w:rPr>
+          <w:rFonts w:cs="Arial"/>
+          <w:b/>
+          <w:bCs/>
         </w:rPr>
         <w:t>tipo</w:t>
       </w:r>
@@ -19183,106 +18742,362 @@
       <w:r>
         <w:rPr>
           <w:rFonts w:cs="Arial"/>
-        </w:rPr>
-        <w:t xml:space="preserve"> no es </w:t>
-      </w:r>
-      <w:proofErr w:type="spellStart"/>
-      <w:r>
-        <w:rPr>
-          <w:rFonts w:cs="Arial"/>
-        </w:rPr>
-        <w:t>válido</w:t>
-      </w:r>
-      <w:proofErr w:type="spellEnd"/>
-      <w:r>
-        <w:rPr>
-          <w:rFonts w:cs="Arial"/>
-        </w:rPr>
-        <w:t xml:space="preserve">, </w:t>
-      </w:r>
-      <w:proofErr w:type="spellStart"/>
-      <w:r>
-        <w:rPr>
-          <w:rFonts w:cs="Arial"/>
-        </w:rPr>
-        <w:t>lanza</w:t>
-      </w:r>
-      <w:proofErr w:type="spellEnd"/>
-      <w:r>
-        <w:rPr>
-          <w:rFonts w:cs="Arial"/>
-        </w:rPr>
-        <w:t xml:space="preserve"> un error </w:t>
-      </w:r>
-      <w:proofErr w:type="spellStart"/>
-      <w:r>
-        <w:rPr>
-          <w:rFonts w:cs="Arial"/>
-        </w:rPr>
-        <w:t>controlado</w:t>
-      </w:r>
-      <w:proofErr w:type="spellEnd"/>
-      <w:r>
-        <w:rPr>
-          <w:rFonts w:cs="Arial"/>
-        </w:rPr>
-        <w:t>.</w:t>
+          <w:b/>
+          <w:bCs/>
+        </w:rPr>
+        <w:t>)</w:t>
       </w:r>
     </w:p>
     <w:p>
       <w:pPr>
         <w:spacing w:line="480" w:lineRule="auto"/>
         <w:ind w:firstLine="720"/>
-        <w:jc w:val="center"/>
-        <w:rPr>
-          <w:rFonts w:cs="Arial"/>
-        </w:rPr>
-      </w:pPr>
+        <w:rPr>
+          <w:rFonts w:cs="Arial"/>
+        </w:rPr>
+      </w:pPr>
+      <w:proofErr w:type="spellStart"/>
+      <w:r>
+        <w:rPr>
+          <w:rFonts w:cs="Arial"/>
+        </w:rPr>
+        <w:lastRenderedPageBreak/>
+        <w:t>Est</w:t>
+      </w:r>
+      <w:r>
+        <w:rPr>
+          <w:rFonts w:cs="Arial"/>
+        </w:rPr>
+        <w:t>o</w:t>
+      </w:r>
+      <w:proofErr w:type="spellEnd"/>
+      <w:r>
+        <w:rPr>
+          <w:rFonts w:cs="Arial"/>
+        </w:rPr>
+        <w:t xml:space="preserve"> es lo </w:t>
+      </w:r>
+      <w:proofErr w:type="spellStart"/>
+      <w:r>
+        <w:rPr>
+          <w:rFonts w:cs="Arial"/>
+        </w:rPr>
+        <w:t>más</w:t>
+      </w:r>
+      <w:proofErr w:type="spellEnd"/>
+      <w:r>
+        <w:rPr>
+          <w:rFonts w:cs="Arial"/>
+        </w:rPr>
+        <w:t xml:space="preserve"> </w:t>
+      </w:r>
+      <w:proofErr w:type="spellStart"/>
+      <w:r>
+        <w:rPr>
+          <w:rFonts w:cs="Arial"/>
+        </w:rPr>
+        <w:t>importante</w:t>
+      </w:r>
+      <w:proofErr w:type="spellEnd"/>
+      <w:r>
+        <w:rPr>
+          <w:rFonts w:cs="Arial"/>
+        </w:rPr>
+        <w:t xml:space="preserve"> del </w:t>
+      </w:r>
+      <w:proofErr w:type="spellStart"/>
+      <w:r>
+        <w:rPr>
+          <w:rFonts w:cs="Arial"/>
+        </w:rPr>
+        <w:t>patrón</w:t>
+      </w:r>
+      <w:proofErr w:type="spellEnd"/>
+      <w:r>
+        <w:rPr>
+          <w:rFonts w:cs="Arial"/>
+        </w:rPr>
+        <w:t xml:space="preserve">. Es </w:t>
+      </w:r>
+      <w:proofErr w:type="spellStart"/>
+      <w:r>
+        <w:rPr>
+          <w:rFonts w:cs="Arial"/>
+        </w:rPr>
+        <w:t>el</w:t>
+      </w:r>
+      <w:proofErr w:type="spellEnd"/>
+      <w:r>
+        <w:rPr>
+          <w:rFonts w:cs="Arial"/>
+        </w:rPr>
+        <w:t xml:space="preserve"> </w:t>
+      </w:r>
+      <w:proofErr w:type="spellStart"/>
+      <w:r>
+        <w:rPr>
+          <w:rFonts w:cs="Arial"/>
+        </w:rPr>
+        <w:t>único</w:t>
+      </w:r>
+      <w:proofErr w:type="spellEnd"/>
+      <w:r>
+        <w:rPr>
+          <w:rFonts w:cs="Arial"/>
+        </w:rPr>
+        <w:t xml:space="preserve"> </w:t>
+      </w:r>
+      <w:proofErr w:type="spellStart"/>
+      <w:r>
+        <w:rPr>
+          <w:rFonts w:cs="Arial"/>
+        </w:rPr>
+        <w:t>lugar</w:t>
+      </w:r>
+      <w:proofErr w:type="spellEnd"/>
+      <w:r>
+        <w:rPr>
+          <w:rFonts w:cs="Arial"/>
+        </w:rPr>
+        <w:t xml:space="preserve"> del </w:t>
+      </w:r>
+      <w:proofErr w:type="spellStart"/>
+      <w:r>
+        <w:rPr>
+          <w:rFonts w:cs="Arial"/>
+        </w:rPr>
+        <w:t>sistema</w:t>
+      </w:r>
+      <w:proofErr w:type="spellEnd"/>
+      <w:r>
+        <w:rPr>
+          <w:rFonts w:cs="Arial"/>
+        </w:rPr>
+        <w:t xml:space="preserve"> </w:t>
+      </w:r>
+      <w:proofErr w:type="spellStart"/>
+      <w:r>
+        <w:rPr>
+          <w:rFonts w:cs="Arial"/>
+        </w:rPr>
+        <w:t>donde</w:t>
+      </w:r>
+      <w:proofErr w:type="spellEnd"/>
+      <w:r>
+        <w:rPr>
+          <w:rFonts w:cs="Arial"/>
+        </w:rPr>
+        <w:t xml:space="preserve"> </w:t>
+      </w:r>
+      <w:proofErr w:type="spellStart"/>
+      <w:r>
+        <w:rPr>
+          <w:rFonts w:cs="Arial"/>
+        </w:rPr>
+        <w:t>aparece</w:t>
+      </w:r>
+      <w:proofErr w:type="spellEnd"/>
+      <w:r>
+        <w:rPr>
+          <w:rFonts w:cs="Arial"/>
+        </w:rPr>
+        <w:t xml:space="preserve"> new </w:t>
+      </w:r>
+      <w:proofErr w:type="spellStart"/>
+      <w:proofErr w:type="gramStart"/>
+      <w:r>
+        <w:rPr>
+          <w:rFonts w:cs="Arial"/>
+        </w:rPr>
+        <w:t>FreePlan</w:t>
+      </w:r>
+      <w:proofErr w:type="spellEnd"/>
+      <w:r>
+        <w:rPr>
+          <w:rFonts w:cs="Arial"/>
+        </w:rPr>
+        <w:t>(</w:t>
+      </w:r>
+      <w:proofErr w:type="gramEnd"/>
+      <w:r>
+        <w:rPr>
+          <w:rFonts w:cs="Arial"/>
+        </w:rPr>
+        <w:t xml:space="preserve">), new </w:t>
+      </w:r>
+      <w:proofErr w:type="spellStart"/>
+      <w:r>
+        <w:rPr>
+          <w:rFonts w:cs="Arial"/>
+        </w:rPr>
+        <w:t>BasicoPlan</w:t>
+      </w:r>
+      <w:proofErr w:type="spellEnd"/>
+      <w:r>
+        <w:rPr>
+          <w:rFonts w:cs="Arial"/>
+        </w:rPr>
+        <w:t xml:space="preserve">(), etc. </w:t>
+      </w:r>
+      <w:proofErr w:type="spellStart"/>
+      <w:r>
+        <w:rPr>
+          <w:rFonts w:cs="Arial"/>
+        </w:rPr>
+        <w:t>Recibe</w:t>
+      </w:r>
+      <w:proofErr w:type="spellEnd"/>
+      <w:r>
+        <w:rPr>
+          <w:rFonts w:cs="Arial"/>
+        </w:rPr>
+        <w:t xml:space="preserve"> un string ('free', '</w:t>
+      </w:r>
+      <w:proofErr w:type="spellStart"/>
+      <w:r>
+        <w:rPr>
+          <w:rFonts w:cs="Arial"/>
+        </w:rPr>
+        <w:t>basico</w:t>
+      </w:r>
+      <w:proofErr w:type="spellEnd"/>
+      <w:r>
+        <w:rPr>
+          <w:rFonts w:cs="Arial"/>
+        </w:rPr>
+        <w:t xml:space="preserve">', 'premium', 'familiar'), </w:t>
+      </w:r>
+      <w:proofErr w:type="spellStart"/>
+      <w:r>
+        <w:rPr>
+          <w:rFonts w:cs="Arial"/>
+        </w:rPr>
+        <w:t>hace</w:t>
+      </w:r>
+      <w:proofErr w:type="spellEnd"/>
+      <w:r>
+        <w:rPr>
+          <w:rFonts w:cs="Arial"/>
+        </w:rPr>
+        <w:t xml:space="preserve"> un switch, y </w:t>
+      </w:r>
+      <w:proofErr w:type="spellStart"/>
+      <w:r>
+        <w:rPr>
+          <w:rFonts w:cs="Arial"/>
+        </w:rPr>
+        <w:t>devuelve</w:t>
+      </w:r>
+      <w:proofErr w:type="spellEnd"/>
+      <w:r>
+        <w:rPr>
+          <w:rFonts w:cs="Arial"/>
+        </w:rPr>
+        <w:t xml:space="preserve"> la </w:t>
+      </w:r>
+      <w:proofErr w:type="spellStart"/>
+      <w:r>
+        <w:rPr>
+          <w:rFonts w:cs="Arial"/>
+        </w:rPr>
+        <w:t>instancia</w:t>
+      </w:r>
+      <w:proofErr w:type="spellEnd"/>
+      <w:r>
+        <w:rPr>
+          <w:rFonts w:cs="Arial"/>
+        </w:rPr>
+        <w:t xml:space="preserve"> </w:t>
+      </w:r>
+      <w:proofErr w:type="spellStart"/>
+      <w:r>
+        <w:rPr>
+          <w:rFonts w:cs="Arial"/>
+        </w:rPr>
+        <w:t>correspondiente</w:t>
+      </w:r>
+      <w:proofErr w:type="spellEnd"/>
+      <w:r>
+        <w:rPr>
+          <w:rFonts w:cs="Arial"/>
+        </w:rPr>
+        <w:t xml:space="preserve">. Si </w:t>
+      </w:r>
+      <w:proofErr w:type="spellStart"/>
+      <w:r>
+        <w:rPr>
+          <w:rFonts w:cs="Arial"/>
+        </w:rPr>
+        <w:t>el</w:t>
+      </w:r>
+      <w:proofErr w:type="spellEnd"/>
+      <w:r>
+        <w:rPr>
+          <w:rFonts w:cs="Arial"/>
+        </w:rPr>
+        <w:t xml:space="preserve"> </w:t>
+      </w:r>
+      <w:proofErr w:type="spellStart"/>
+      <w:r>
+        <w:rPr>
+          <w:rFonts w:cs="Arial"/>
+        </w:rPr>
+        <w:t>tipo</w:t>
+      </w:r>
+      <w:proofErr w:type="spellEnd"/>
+      <w:r>
+        <w:rPr>
+          <w:rFonts w:cs="Arial"/>
+        </w:rPr>
+        <w:t xml:space="preserve"> no es </w:t>
+      </w:r>
+      <w:proofErr w:type="spellStart"/>
+      <w:r>
+        <w:rPr>
+          <w:rFonts w:cs="Arial"/>
+        </w:rPr>
+        <w:t>válido</w:t>
+      </w:r>
+      <w:proofErr w:type="spellEnd"/>
+      <w:r>
+        <w:rPr>
+          <w:rFonts w:cs="Arial"/>
+        </w:rPr>
+        <w:t xml:space="preserve">, </w:t>
+      </w:r>
+      <w:proofErr w:type="spellStart"/>
+      <w:r>
+        <w:rPr>
+          <w:rFonts w:cs="Arial"/>
+        </w:rPr>
+        <w:t>lanza</w:t>
+      </w:r>
+      <w:proofErr w:type="spellEnd"/>
+      <w:r>
+        <w:rPr>
+          <w:rFonts w:cs="Arial"/>
+        </w:rPr>
+        <w:t xml:space="preserve"> un error </w:t>
+      </w:r>
+      <w:proofErr w:type="spellStart"/>
+      <w:r>
+        <w:rPr>
+          <w:rFonts w:cs="Arial"/>
+        </w:rPr>
+        <w:t>controlado</w:t>
+      </w:r>
+      <w:proofErr w:type="spellEnd"/>
+      <w:r>
+        <w:rPr>
+          <w:rFonts w:cs="Arial"/>
+        </w:rPr>
+        <w:t>.</w:t>
+      </w:r>
     </w:p>
     <w:p>
       <w:pPr>
         <w:spacing w:line="480" w:lineRule="auto"/>
         <w:ind w:firstLine="720"/>
-        <w:jc w:val="center"/>
-        <w:rPr>
-          <w:rFonts w:cs="Arial"/>
-        </w:rPr>
-      </w:pPr>
-    </w:p>
-    <w:p>
-      <w:pPr>
-        <w:spacing w:line="480" w:lineRule="auto"/>
-        <w:ind w:firstLine="720"/>
-        <w:jc w:val="center"/>
-        <w:rPr>
-          <w:rFonts w:cs="Arial"/>
-        </w:rPr>
-      </w:pPr>
-    </w:p>
-    <w:p>
-      <w:pPr>
-        <w:spacing w:line="480" w:lineRule="auto"/>
-        <w:ind w:firstLine="720"/>
-        <w:jc w:val="center"/>
-        <w:rPr>
-          <w:rFonts w:cs="Arial"/>
-        </w:rPr>
-      </w:pPr>
-    </w:p>
-    <w:p>
-      <w:pPr>
-        <w:spacing w:line="480" w:lineRule="auto"/>
-        <w:ind w:firstLine="720"/>
-        <w:jc w:val="center"/>
-        <w:rPr>
-          <w:rFonts w:cs="Arial"/>
-        </w:rPr>
-      </w:pPr>
-    </w:p>
-    <w:p>
-      <w:pPr>
-        <w:spacing w:line="480" w:lineRule="auto"/>
-        <w:ind w:firstLine="720"/>
         <w:rPr>
           <w:rFonts w:cs="Arial"/>
           <w:b/>
@@ -19296,7 +19111,6 @@
           <w:b/>
           <w:bCs/>
         </w:rPr>
-        <w:lastRenderedPageBreak/>
         <w:t>Dónde</w:t>
       </w:r>
       <w:proofErr w:type="spellEnd"/>
@@ -19901,26 +19715,6 @@
         </w:rPr>
         <w:t>.</w:t>
       </w:r>
-    </w:p>
-    <w:p>
-      <w:pPr>
-        <w:pStyle w:val="Prrafodelista"/>
-        <w:spacing w:line="480" w:lineRule="auto"/>
-        <w:jc w:val="center"/>
-        <w:rPr>
-          <w:rFonts w:cs="Arial"/>
-        </w:rPr>
-      </w:pPr>
-    </w:p>
-    <w:p>
-      <w:pPr>
-        <w:pStyle w:val="Prrafodelista"/>
-        <w:spacing w:line="480" w:lineRule="auto"/>
-        <w:jc w:val="center"/>
-        <w:rPr>
-          <w:rFonts w:cs="Arial"/>
-        </w:rPr>
-      </w:pPr>
     </w:p>
     <w:p>
       <w:pPr>
@@ -22465,6 +22259,7 @@
     <w:lsdException w:name="HTML Sample" w:semiHidden="1" w:unhideWhenUsed="1"/>
     <w:lsdException w:name="HTML Typewriter" w:semiHidden="1" w:unhideWhenUsed="1"/>
     <w:lsdException w:name="HTML Variable" w:semiHidden="1" w:unhideWhenUsed="1"/>
+    <w:lsdException w:name="Normal Table" w:semiHidden="1" w:unhideWhenUsed="1"/>
     <w:lsdException w:name="annotation subject" w:semiHidden="1" w:unhideWhenUsed="1"/>
     <w:lsdException w:name="No List" w:semiHidden="1" w:unhideWhenUsed="1"/>
     <w:lsdException w:name="Outline List 1" w:semiHidden="1" w:unhideWhenUsed="1"/>
@@ -22507,8 +22302,11 @@
     <w:lsdException w:name="Table Contemporary" w:semiHidden="1" w:unhideWhenUsed="1"/>
     <w:lsdException w:name="Table Elegant" w:semiHidden="1" w:unhideWhenUsed="1"/>
     <w:lsdException w:name="Table Professional" w:semiHidden="1" w:unhideWhenUsed="1"/>
+    <w:lsdException w:name="Table Subtle 1" w:semiHidden="1" w:unhideWhenUsed="1"/>
     <w:lsdException w:name="Table Subtle 2" w:semiHidden="1" w:unhideWhenUsed="1"/>
     <w:lsdException w:name="Table Web 1" w:semiHidden="1" w:unhideWhenUsed="1"/>
+    <w:lsdException w:name="Table Web 2" w:semiHidden="1" w:unhideWhenUsed="1"/>
+    <w:lsdException w:name="Table Web 3" w:semiHidden="1" w:unhideWhenUsed="1"/>
     <w:lsdException w:name="Balloon Text" w:semiHidden="1" w:unhideWhenUsed="1"/>
     <w:lsdException w:name="Table Grid" w:uiPriority="59"/>
     <w:lsdException w:name="Table Theme" w:semiHidden="1" w:unhideWhenUsed="1"/>

</xml_diff>